<commit_message>
Fix full content and bookmarks
</commit_message>
<xml_diff>
--- a/Patient education/膝扭傷後的內側膝痛及後小腿痛.docx
+++ b/Patient education/膝扭傷後的內側膝痛及後小腿痛.docx
@@ -58,7 +58,65 @@
       </w:r>
       <w:bookmarkEnd w:id="0"/>
     </w:p>
-    <w:p/>
+    <w:p>
+      <w:r>
+        <w:t>膝蓋扭傷後，為什麼內側膝蓋和小腿後面會痛？</w:t>
+        <w:br/>
+        <w:br/>
+        <w:t>當您的膝蓋扭傷後，如果同時感到膝蓋內側疼痛、壓痛，以及小腿後側疼痛，這通常不是單一問題，可能代表以下幾個部位的組織受傷了：</w:t>
+        <w:br/>
+        <w:t>內側小腿肌肉拉傷（醫學上稱為「網球腿」）：這是最常見的原因之一。</w:t>
+        <w:br/>
+        <w:t>膝蓋內側的主要韌帶受傷（內側副韌帶，MCL）。</w:t>
+        <w:br/>
+        <w:t>膝蓋後方的主要韌帶受傷（後十字韌帶，PCL）。</w:t>
+        <w:br/>
+        <w:t>膝蓋後內側的複雜支撐結構受傷（後內側角結構）。</w:t>
+        <w:br/>
+        <w:t>什麼是這些受傷的部位？</w:t>
+        <w:br/>
+        <w:t>內側副韌帶 (MCL)：位於膝蓋內側，主要負責膝蓋的穩定。</w:t>
+        <w:br/>
+        <w:t>常見原因：膝蓋伸直或微彎時，膝蓋受到外側撞擊或外翻力量（例如有人撞擊您的膝蓋外側）。</w:t>
+        <w:br/>
+        <w:t>症狀：通常只有膝蓋內側疼痛。如果後小腿也痛，可能合併其他地方受傷。</w:t>
+        <w:br/>
+        <w:t>後十字韌帶 (PCL)：位於膝蓋中央後方，防止小腿骨過度後移。</w:t>
+        <w:br/>
+        <w:t>常見原因：腳掌固定時小腿前側受到撞擊，或膝蓋過度彎曲跌倒。</w:t>
+        <w:br/>
+        <w:t>症狀：通常比前十字韌帶 (ACL) 撕裂輕微，但可能在膝蓋彎曲時感到內側不適。</w:t>
+        <w:br/>
+        <w:t>後內側角結構：膝蓋內側後方的一組小韌帶和肌腱，與 MCL 和 PCL 損傷常常同時發生。</w:t>
+        <w:br/>
+        <w:t>內側小腿肌肉（內側腓腸肌）拉傷：俗稱「網球腿」。</w:t>
+        <w:br/>
+        <w:t>常見原因：突然用力伸直膝蓋並同時腳尖上勾（離心收縮），例如跑步突然加速或跳躍時。</w:t>
+        <w:br/>
+        <w:t>症狀：小腿後內側急性疼痛，有時疼痛會延伸到膝蓋內側。</w:t>
+        <w:br/>
+        <w:t>醫師如何判斷？</w:t>
+        <w:br/>
+        <w:br/>
+        <w:t>當您同時出現內側膝蓋和小腿後側疼痛時，醫師會懷疑以下幾種情況：</w:t>
+        <w:br/>
+        <w:t>MCL 韌帶受傷合併小腿肌肉拉傷。</w:t>
+        <w:br/>
+        <w:t>PCL 韌帶受傷合併後內側角結構受傷。</w:t>
+        <w:br/>
+        <w:t>單純小腿肌肉拉傷，但疼痛傳到膝蓋內側。</w:t>
+        <w:br/>
+        <w:t>檢查方式：</w:t>
+        <w:br/>
+        <w:t>理學檢查：醫師會用手檢查膝蓋穩定度（MCL 外翻壓力測試、PCL 後抽屜測試），並按壓小腿上方的內側肌肉交界處。</w:t>
+        <w:br/>
+        <w:t>影像檢查：</w:t>
+        <w:br/>
+        <w:t>MRI（核磁共振）：能清楚看到韌帶和肌肉的詳細損傷情況。</w:t>
+        <w:br/>
+        <w:t>超音波：特別適合初步評估小腿肌肉（腓腸肌）拉傷。</w:t>
+      </w:r>
+    </w:p>
     <w:p>
       <w:bookmarkStart w:id="0" w:name="sec2"/>
       <w:pPr>
@@ -69,7 +127,27 @@
       </w:r>
       <w:bookmarkEnd w:id="0"/>
     </w:p>
-    <w:p/>
+    <w:p>
+      <w:r>
+        <w:t>膝扭傷後的內側膝痛及後小腿痛</w:t>
+        <w:br/>
+        <w:br/>
+        <w:t>膝部扭傷後，若出現後小腿疼痛、內側膝痛及壓痛的組合，最常見的損傷可能性包括：內側腓腸肌（網球腿）、內側副韌帶 (MCL)、後十字韌帶 (PCL)，或後內側角結構（包含後斜韌帶 (POL) 和半膜肌複合體）。</w:t>
+        <w:br/>
+        <w:br/>
+        <w:t>相關解剖學結構</w:t>
+        <w:br/>
+        <w:t>...</w:t>
+        <w:br/>
+        <w:t>[English]</w:t>
+        <w:br/>
+        <w:t>...</w:t>
+        <w:br/>
+        <w:t>[Source]: Openevidence</w:t>
+        <w:br/>
+        <w:t>https://www.openevidence.com/ask/d93364bb-d9f6-4051-a498-5784b6a75a07</w:t>
+      </w:r>
+    </w:p>
     <w:p>
       <w:bookmarkStart w:id="0" w:name="sec3"/>
       <w:pPr>
@@ -82,7 +160,7 @@
     </w:p>
     <w:p>
       <w:r>
-        <w:t>The combination of posterior calf pain and medial knee pain following a sprain suggests injury to the medial gastrocnemius, MCL, or PCL.</w:t>
+        <w:t>...</w:t>
       </w:r>
     </w:p>
     <w:p>

</xml_diff>

<commit_message>
Rewrite knee sprain source DOCX with full professional content
</commit_message>
<xml_diff>
--- a/Patient education/膝扭傷後的內側膝痛及後小腿痛.docx
+++ b/Patient education/膝扭傷後的內側膝痛及後小腿痛.docx
@@ -4,180 +4,158 @@
   <w:body>
     <w:p>
       <w:pPr>
-        <w:jc w:val="center"/>
+        <w:pStyle w:val="Heading1"/>
       </w:pPr>
       <w:r>
-        <w:t>[簡易版]</w:t>
-        <w:fldChar w:fldCharType="begin"/>
-        <w:instrText xml:space="preserve"> HYPERLINK \l "sec1" </w:instrText>
-        <w:fldChar w:fldCharType="separate"/>
-        <w:r/>
-        <w:fldChar w:fldCharType="end"/>
-      </w:r>
-      <w:r>
-        <w:t xml:space="preserve">   </w:t>
-      </w:r>
-      <w:r>
-        <w:t>[專業版]</w:t>
-        <w:fldChar w:fldCharType="begin"/>
-        <w:instrText xml:space="preserve"> HYPERLINK \l "sec2" </w:instrText>
-        <w:fldChar w:fldCharType="separate"/>
-        <w:r/>
-        <w:fldChar w:fldCharType="end"/>
-      </w:r>
-      <w:r>
-        <w:t xml:space="preserve">   </w:t>
-      </w:r>
-      <w:r>
-        <w:t>[English]</w:t>
-        <w:fldChar w:fldCharType="begin"/>
-        <w:instrText xml:space="preserve"> HYPERLINK \l "sec3" </w:instrText>
-        <w:fldChar w:fldCharType="separate"/>
-        <w:r/>
-        <w:fldChar w:fldCharType="end"/>
-      </w:r>
-      <w:r>
-        <w:t xml:space="preserve">   </w:t>
-      </w:r>
-      <w:r>
-        <w:t>[Source]</w:t>
-        <w:fldChar w:fldCharType="begin"/>
-        <w:instrText xml:space="preserve"> HYPERLINK \l "sec4" </w:instrText>
-        <w:fldChar w:fldCharType="separate"/>
-        <w:r/>
-        <w:fldChar w:fldCharType="end"/>
+        <w:t>膝扭傷後的內側膝痛及後小腿痛</w:t>
       </w:r>
     </w:p>
     <w:p>
-      <w:bookmarkStart w:id="0" w:name="sec1"/>
+      <w:r>
+        <w:t>膝部扭傷後若同時出現內側膝痛、壓痛與後內側小腿痛，臨床上最常見的組合為內側腓腸肌（tennis leg）損傷、內側副韌帶（MCL）損傷、後十字韌帶（PCL）損傷，或後內側角（posteromedial corner, PMC）結構受傷。此表現通常代表單一組織以外的複合性損傷，需以機轉、壓痛分布與穩定度檢查綜合判讀。</w:t>
+      </w:r>
+    </w:p>
+    <w:p>
       <w:pPr>
-        <w:pStyle w:val="Heading1"/>
+        <w:pStyle w:val="Heading2"/>
       </w:pPr>
       <w:r>
-        <w:t>【簡易版】</w:t>
+        <w:t>相關解剖與功能</w:t>
       </w:r>
-      <w:bookmarkEnd w:id="0"/>
+    </w:p>
+    <w:p>
+      <w:pPr>
+        <w:pStyle w:val="ListBullet"/>
+      </w:pPr>
+      <w:r>
+        <w:t>淺層 MCL：由股骨內上髁至近端脛骨內側，為抗外翻力量的主要靜態穩定器。</w:t>
+      </w:r>
+    </w:p>
+    <w:p>
+      <w:pPr>
+        <w:pStyle w:val="ListBullet"/>
+      </w:pPr>
+      <w:r>
+        <w:t>深層 MCL（meniscofemoral / meniscotibial）：連結內側半月板，參與關節線穩定。</w:t>
+      </w:r>
+    </w:p>
+    <w:p>
+      <w:pPr>
+        <w:pStyle w:val="ListBullet"/>
+      </w:pPr>
+      <w:r>
+        <w:t>後斜韌帶（POL）與半膜肌複合體：屬於後內側角核心結構，控制伸膝與旋轉時之後內側穩定。</w:t>
+      </w:r>
+    </w:p>
+    <w:p>
+      <w:pPr>
+        <w:pStyle w:val="ListBullet"/>
+      </w:pPr>
+      <w:r>
+        <w:t>內側腓腸肌：起自股骨內髁後方，遠端肌腱交界處為最常見急性撕裂位置。</w:t>
+      </w:r>
+    </w:p>
+    <w:p>
+      <w:pPr>
+        <w:pStyle w:val="Heading2"/>
+      </w:pPr>
+      <w:r>
+        <w:t>常見受傷機轉</w:t>
+      </w:r>
+    </w:p>
+    <w:p>
+      <w:pPr>
+        <w:pStyle w:val="ListBullet"/>
+      </w:pPr>
+      <w:r>
+        <w:t>MCL 損傷：多見於膝關節近伸直或微屈時遭受外翻合併外旋力量。</w:t>
+      </w:r>
+    </w:p>
+    <w:p>
+      <w:pPr>
+        <w:pStyle w:val="ListBullet"/>
+      </w:pPr>
+      <w:r>
+        <w:t>PCL 損傷：常由脛骨受後向撞擊（如 dashboard injury）或膝過度屈曲跌倒造成。</w:t>
+      </w:r>
+    </w:p>
+    <w:p>
+      <w:pPr>
+        <w:pStyle w:val="ListBullet"/>
+      </w:pPr>
+      <w:r>
+        <w:t>後內側角損傷：常與 MCL 或 PCL 同時受傷，屬多韌帶損傷光譜的一部分。</w:t>
+      </w:r>
+    </w:p>
+    <w:p>
+      <w:pPr>
+        <w:pStyle w:val="ListBullet"/>
+      </w:pPr>
+      <w:r>
+        <w:t>內側腓腸肌撕裂（tennis leg）：常見於膝伸直合併踝背屈下突發離心收縮。</w:t>
+      </w:r>
+    </w:p>
+    <w:p>
+      <w:pPr>
+        <w:pStyle w:val="Heading2"/>
+      </w:pPr>
+      <w:r>
+        <w:t>臨床鑑別重點</w:t>
+      </w:r>
+    </w:p>
+    <w:p>
+      <w:pPr>
+        <w:pStyle w:val="ListBullet"/>
+      </w:pPr>
+      <w:r>
+        <w:t>MCL 合併內側腓腸肌損傷：內側關節線壓痛加後小腿疼痛最常見。</w:t>
+      </w:r>
+    </w:p>
+    <w:p>
+      <w:pPr>
+        <w:pStyle w:val="ListBullet"/>
+      </w:pPr>
+      <w:r>
+        <w:t>PCL 合併後內側角損傷：若有後向受力或過度屈曲機轉須高度懷疑。</w:t>
+      </w:r>
+    </w:p>
+    <w:p>
+      <w:pPr>
+        <w:pStyle w:val="ListBullet"/>
+      </w:pPr>
+      <w:r>
+        <w:t>單純內側腓腸肌拉傷：可出現向膝內側放散痛，需與韌帶損傷區分。</w:t>
+      </w:r>
+    </w:p>
+    <w:p>
+      <w:pPr>
+        <w:pStyle w:val="Heading2"/>
+      </w:pPr>
+      <w:r>
+        <w:t>理學檢查與影像建議</w:t>
+      </w:r>
     </w:p>
     <w:p>
       <w:r>
-        <w:t>膝蓋扭傷後，為什麼內側膝蓋和小腿後面會痛？</w:t>
-        <w:br/>
-        <w:br/>
-        <w:t>當您的膝蓋扭傷後，如果同時感到膝蓋內側疼痛、壓痛，以及小腿後側疼痛，這通常不是單一問題，可能代表以下幾個部位的組織受傷了：</w:t>
-        <w:br/>
-        <w:t>內側小腿肌肉拉傷（醫學上稱為「網球腿」）：這是最常見的原因之一。</w:t>
-        <w:br/>
-        <w:t>膝蓋內側的主要韌帶受傷（內側副韌帶，MCL）。</w:t>
-        <w:br/>
-        <w:t>膝蓋後方的主要韌帶受傷（後十字韌帶，PCL）。</w:t>
-        <w:br/>
-        <w:t>膝蓋後內側的複雜支撐結構受傷（後內側角結構）。</w:t>
-        <w:br/>
-        <w:t>什麼是這些受傷的部位？</w:t>
-        <w:br/>
-        <w:t>內側副韌帶 (MCL)：位於膝蓋內側，主要負責膝蓋的穩定。</w:t>
-        <w:br/>
-        <w:t>常見原因：膝蓋伸直或微彎時，膝蓋受到外側撞擊或外翻力量（例如有人撞擊您的膝蓋外側）。</w:t>
-        <w:br/>
-        <w:t>症狀：通常只有膝蓋內側疼痛。如果後小腿也痛，可能合併其他地方受傷。</w:t>
-        <w:br/>
-        <w:t>後十字韌帶 (PCL)：位於膝蓋中央後方，防止小腿骨過度後移。</w:t>
-        <w:br/>
-        <w:t>常見原因：腳掌固定時小腿前側受到撞擊，或膝蓋過度彎曲跌倒。</w:t>
-        <w:br/>
-        <w:t>症狀：通常比前十字韌帶 (ACL) 撕裂輕微，但可能在膝蓋彎曲時感到內側不適。</w:t>
-        <w:br/>
-        <w:t>後內側角結構：膝蓋內側後方的一組小韌帶和肌腱，與 MCL 和 PCL 損傷常常同時發生。</w:t>
-        <w:br/>
-        <w:t>內側小腿肌肉（內側腓腸肌）拉傷：俗稱「網球腿」。</w:t>
-        <w:br/>
-        <w:t>常見原因：突然用力伸直膝蓋並同時腳尖上勾（離心收縮），例如跑步突然加速或跳躍時。</w:t>
-        <w:br/>
-        <w:t>症狀：小腿後內側急性疼痛，有時疼痛會延伸到膝蓋內側。</w:t>
-        <w:br/>
-        <w:t>醫師如何判斷？</w:t>
-        <w:br/>
-        <w:br/>
-        <w:t>當您同時出現內側膝蓋和小腿後側疼痛時，醫師會懷疑以下幾種情況：</w:t>
-        <w:br/>
-        <w:t>MCL 韌帶受傷合併小腿肌肉拉傷。</w:t>
-        <w:br/>
-        <w:t>PCL 韌帶受傷合併後內側角結構受傷。</w:t>
-        <w:br/>
-        <w:t>單純小腿肌肉拉傷，但疼痛傳到膝蓋內側。</w:t>
-        <w:br/>
-        <w:t>檢查方式：</w:t>
-        <w:br/>
-        <w:t>理學檢查：醫師會用手檢查膝蓋穩定度（MCL 外翻壓力測試、PCL 後抽屜測試），並按壓小腿上方的內側肌肉交界處。</w:t>
-        <w:br/>
-        <w:t>影像檢查：</w:t>
-        <w:br/>
-        <w:t>MRI（核磁共振）：能清楚看到韌帶和肌肉的詳細損傷情況。</w:t>
-        <w:br/>
-        <w:t>超音波：特別適合初步評估小腿肌肉（腓腸肌）拉傷。</w:t>
+        <w:t>理學檢查應包含 30° 與全伸直之外翻壓力測試（MCL）、後抽屜與 posterior sag（PCL），並觸診近端內側腓腸肌肌腱交界處。MRI 可同時評估韌帶與肌肉損傷程度，超音波適合快速辨識腓腸肌撕裂、血腫與積液。</w:t>
       </w:r>
     </w:p>
     <w:p>
-      <w:bookmarkStart w:id="0" w:name="sec2"/>
       <w:pPr>
-        <w:pStyle w:val="Heading1"/>
+        <w:pStyle w:val="Heading2"/>
       </w:pPr>
       <w:r>
-        <w:t>【專業版】</w:t>
+        <w:t>初步處置與追蹤</w:t>
       </w:r>
-      <w:bookmarkEnd w:id="0"/>
     </w:p>
     <w:p>
       <w:r>
-        <w:t>膝扭傷後的內側膝痛及後小腿痛</w:t>
-        <w:br/>
-        <w:br/>
-        <w:t>膝部扭傷後，若出現後小腿疼痛、內側膝痛及壓痛的組合，最常見的損傷可能性包括：內側腓腸肌（網球腿）、內側副韌帶 (MCL)、後十字韌帶 (PCL)，或後內側角結構（包含後斜韌帶 (POL) 和半膜肌複合體）。</w:t>
-        <w:br/>
-        <w:br/>
-        <w:t>相關解剖學結構</w:t>
-        <w:br/>
-        <w:t>...</w:t>
-        <w:br/>
-        <w:t>[English]</w:t>
-        <w:br/>
-        <w:t>...</w:t>
-        <w:br/>
-        <w:t>[Source]: Openevidence</w:t>
-        <w:br/>
-        <w:t>https://www.openevidence.com/ask/d93364bb-d9f6-4051-a498-5784b6a75a07</w:t>
+        <w:t>急性期建議依 RICE 原則處置（休息、冰敷、加壓、抬高），並依不穩定程度安排護具與復健。若存在明顯後向不穩定、持續功能受限、懷疑多韌帶損傷或影像顯示高階斷裂，應儘速轉介骨科或運動醫學專科評估進一步治療（含手術重建）可能性。</w:t>
       </w:r>
     </w:p>
     <w:p>
-      <w:bookmarkStart w:id="0" w:name="sec3"/>
-      <w:pPr>
-        <w:pStyle w:val="Heading1"/>
-      </w:pPr>
       <w:r>
-        <w:t>[English]</w:t>
-      </w:r>
-      <w:bookmarkEnd w:id="0"/>
-    </w:p>
-    <w:p>
-      <w:r>
-        <w:t>...</w:t>
-      </w:r>
-    </w:p>
-    <w:p>
-      <w:bookmarkStart w:id="0" w:name="sec4"/>
-      <w:pPr>
-        <w:pStyle w:val="Heading1"/>
-      </w:pPr>
-      <w:r>
-        <w:t>[Source]</w:t>
-      </w:r>
-      <w:bookmarkEnd w:id="0"/>
-    </w:p>
-    <w:p>
-      <w:r>
-        <w:t>Openevidence</w:t>
-        <w:br/>
-        <w:t>https://www.openevidence.com/ask/d93364bb-d9f6-4051-a498-5784b6a75a07</w:t>
+        <w:t>Source: https://www.openevidence.com/ask/d93364bb-d9f6-4051-a498-5784b6a75a07</w:t>
       </w:r>
     </w:p>
     <w:sectPr>

</xml_diff>